<commit_message>
Began work on bluetooth connection
</commit_message>
<xml_diff>
--- a/RaspPi/Raspberry Pi Setup/Instructions.docx
+++ b/RaspPi/Raspberry Pi Setup/Instructions.docx
@@ -1569,6 +1569,7 @@
         <w:rPr>
           <w:noProof/>
         </w:rPr>
+        <w:lastRenderedPageBreak/>
         <mc:AlternateContent>
           <mc:Choice Requires="wps">
             <w:drawing>
@@ -1613,53 +1614,69 @@
                             </w:r>
                             <w:r>
                               <w:br/>
-                            </w:r>
-                            <w:r>
                               <w:t>Description=Watch USB share image and sync into payload dir</w:t>
                             </w:r>
                             <w:r>
                               <w:br/>
-                            </w:r>
-                            <w:r>
-                              <w:t>After=usbgadget.service</w:t>
-                            </w:r>
-                            <w:r>
-                              <w:br/>
-                            </w:r>
-                            <w:r>
+                              <w:t>After=usbgadget.service local-fs.target sound.target</w:t>
+                            </w:r>
+                            <w:r>
+                              <w:br/>
                               <w:t>Requires=usbgadget.service</w:t>
                             </w:r>
                             <w:r>
                               <w:br/>
-                            </w:r>
-                            <w:r>
-                              <w:br/>
-                            </w:r>
-                            <w:r>
+                              <w:t>Before=getty.target multi-user.target</w:t>
+                            </w:r>
+                            <w:r>
+                              <w:br/>
+                            </w:r>
+                            <w:r>
+                              <w:br/>
                               <w:t>[Service]</w:t>
                             </w:r>
                             <w:r>
                               <w:br/>
-                            </w:r>
-                            <w:r>
                               <w:t>Type=simple</w:t>
                             </w:r>
                             <w:r>
                               <w:br/>
-                            </w:r>
-                            <w:r>
-                              <w:t>ExecStart=/usr/bin/python3 /opt/usb-watcher/watcher.py</w:t>
-                            </w:r>
-                            <w:r>
-                              <w:br/>
-                            </w:r>
-                            <w:r>
+                              <w:t>Environment=PYTHONUNBUFFERED=1</w:t>
+                            </w:r>
+                            <w:r>
+                              <w:br/>
+                              <w:t># Forces ALSA-based python libraries to explicitly map to the first hardware sound card</w:t>
+                            </w:r>
+                            <w:r>
+                              <w:br/>
+                              <w:t>Environment=AUDIODEV=hw:0</w:t>
+                            </w:r>
+                            <w:r>
+                              <w:br/>
+                              <w:t>WorkingDirectory=/opt/usb-watcher</w:t>
+                            </w:r>
+                            <w:r>
+                              <w:br/>
+                              <w:t># Give the USB sound card hardware a clean 5 seconds to finish its kernel handshake</w:t>
+                            </w:r>
+                            <w:r>
+                              <w:br/>
+                              <w:t>ExecStartPre=/usr/bin/sleep 5</w:t>
+                            </w:r>
+                            <w:r>
+                              <w:br/>
+                              <w:t>ExecStart=/opt/usb-watcher/watcher.py</w:t>
+                            </w:r>
+                            <w:r>
+                              <w:br/>
                               <w:t>Restart=on-failure</w:t>
                             </w:r>
                             <w:r>
                               <w:br/>
-                            </w:r>
-                            <w:r>
+                              <w:t>RestartSec=3</w:t>
+                            </w:r>
+                            <w:r>
+                              <w:br/>
                               <w:t>User=root</w:t>
                             </w:r>
                             <w:r>
@@ -1667,15 +1684,11 @@
                             </w:r>
                             <w:r>
                               <w:br/>
-                            </w:r>
-                            <w:r>
                               <w:t>[Install]</w:t>
                             </w:r>
                             <w:r>
                               <w:br/>
-                            </w:r>
-                            <w:r>
-                              <w:t>WantedBy=multi-user.target</w:t>
+                              <w:t>WantedBy=basic.target</w:t>
                             </w:r>
                           </w:p>
                         </w:txbxContent>
@@ -1689,9 +1702,13 @@
               </wp:inline>
             </w:drawing>
           </mc:Choice>
-          <mc:Fallback xmlns:w16sdtfl="http://schemas.microsoft.com/office/word/2024/wordml/sdtformatlock" xmlns:w16du="http://schemas.microsoft.com/office/word/2023/wordml/word16du">
+          <mc:Fallback>
             <w:pict>
-              <v:shape w14:anchorId="26A5E948" id="_x0000_s1028" type="#_x0000_t202" style="width:447.85pt;height:110.6pt;visibility:visible;mso-wrap-style:square;mso-left-percent:-10001;mso-top-percent:-10001;mso-position-horizontal:absolute;mso-position-horizontal-relative:char;mso-position-vertical:absolute;mso-position-vertical-relative:line;mso-left-percent:-10001;mso-top-percent:-10001;v-text-anchor:top" o:gfxdata="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">
+              <v:shapetype w14:anchorId="26A5E948" id="_x0000_t202" coordsize="21600,21600" o:spt="202" path="m,l,21600r21600,l21600,xe">
+                <v:stroke joinstyle="miter"/>
+                <v:path gradientshapeok="t" o:connecttype="rect"/>
+              </v:shapetype>
+              <v:shape id="_x0000_s1028" type="#_x0000_t202" style="width:447.85pt;height:110.6pt;visibility:visible;mso-wrap-style:square;mso-left-percent:-10001;mso-top-percent:-10001;mso-position-horizontal:absolute;mso-position-horizontal-relative:char;mso-position-vertical:absolute;mso-position-vertical-relative:line;mso-left-percent:-10001;mso-top-percent:-10001;v-text-anchor:top" o:gfxdata="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">
                 <v:textbox style="mso-fit-shape-to-text:t">
                   <w:txbxContent>
                     <w:p>
@@ -1702,20 +1719,70 @@
                         <w:br/>
                       </w:r>
                       <w:r>
-                        <w:t>Description=Watch USB share image and sync into payload dir</w:t>
-                      </w:r>
-                      <w:r>
-                        <w:br/>
-                      </w:r>
-                      <w:r>
-                        <w:t>After=usbgadget.service</w:t>
-                      </w:r>
-                      <w:r>
-                        <w:br/>
-                      </w:r>
-                      <w:r>
-                        <w:t>Requires=usbgadget.service</w:t>
-                      </w:r>
+                        <w:t xml:space="preserve">Description=Watch USB share image and sync into payload </w:t>
+                      </w:r>
+                      <w:proofErr w:type="spellStart"/>
+                      <w:r>
+                        <w:t>dir</w:t>
+                      </w:r>
+                      <w:proofErr w:type="spellEnd"/>
+                      <w:r>
+                        <w:br/>
+                      </w:r>
+                      <w:r>
+                        <w:t>After=</w:t>
+                      </w:r>
+                      <w:proofErr w:type="spellStart"/>
+                      <w:r>
+                        <w:t>usbgadget.service</w:t>
+                      </w:r>
+                      <w:proofErr w:type="spellEnd"/>
+                      <w:r>
+                        <w:t xml:space="preserve"> local-</w:t>
+                      </w:r>
+                      <w:proofErr w:type="spellStart"/>
+                      <w:r>
+                        <w:t>fs.target</w:t>
+                      </w:r>
+                      <w:proofErr w:type="spellEnd"/>
+                      <w:r>
+                        <w:t xml:space="preserve"> </w:t>
+                      </w:r>
+                      <w:proofErr w:type="spellStart"/>
+                      <w:r>
+                        <w:t>sound.target</w:t>
+                      </w:r>
+                      <w:proofErr w:type="spellEnd"/>
+                      <w:r>
+                        <w:br/>
+                      </w:r>
+                      <w:r>
+                        <w:t>Requires=</w:t>
+                      </w:r>
+                      <w:proofErr w:type="spellStart"/>
+                      <w:r>
+                        <w:t>usbgadget.service</w:t>
+                      </w:r>
+                      <w:proofErr w:type="spellEnd"/>
+                      <w:r>
+                        <w:br/>
+                      </w:r>
+                      <w:r>
+                        <w:t>Before=</w:t>
+                      </w:r>
+                      <w:proofErr w:type="spellStart"/>
+                      <w:r>
+                        <w:t>getty.target</w:t>
+                      </w:r>
+                      <w:proofErr w:type="spellEnd"/>
+                      <w:r>
+                        <w:t xml:space="preserve"> multi-</w:t>
+                      </w:r>
+                      <w:proofErr w:type="spellStart"/>
+                      <w:r>
+                        <w:t>user.target</w:t>
+                      </w:r>
+                      <w:proofErr w:type="spellEnd"/>
                       <w:r>
                         <w:br/>
                       </w:r>
@@ -1735,7 +1802,69 @@
                         <w:br/>
                       </w:r>
                       <w:r>
-                        <w:t>ExecStart=/usr/bin/python3 /opt/usb-watcher/watcher.py</w:t>
+                        <w:t>Environment=PYTHONUNBUFFERED=1</w:t>
+                      </w:r>
+                      <w:r>
+                        <w:br/>
+                      </w:r>
+                      <w:r>
+                        <w:t># Forces ALSA-based python libraries to explicitly map to the first hardware sound card</w:t>
+                      </w:r>
+                      <w:r>
+                        <w:br/>
+                      </w:r>
+                      <w:r>
+                        <w:t>Environment=AUDIODEV=hw:0</w:t>
+                      </w:r>
+                      <w:r>
+                        <w:br/>
+                      </w:r>
+                      <w:proofErr w:type="spellStart"/>
+                      <w:r>
+                        <w:t>WorkingDirectory</w:t>
+                      </w:r>
+                      <w:proofErr w:type="spellEnd"/>
+                      <w:r>
+                        <w:t>=/opt/</w:t>
+                      </w:r>
+                      <w:proofErr w:type="spellStart"/>
+                      <w:r>
+                        <w:t>usb</w:t>
+                      </w:r>
+                      <w:proofErr w:type="spellEnd"/>
+                      <w:r>
+                        <w:t>-watcher</w:t>
+                      </w:r>
+                      <w:r>
+                        <w:br/>
+                      </w:r>
+                      <w:r>
+                        <w:t># Give the USB sound card hardware a clean 5 seconds to finish its kernel handshake</w:t>
+                      </w:r>
+                      <w:r>
+                        <w:br/>
+                      </w:r>
+                      <w:proofErr w:type="spellStart"/>
+                      <w:r>
+                        <w:t>ExecStartPre</w:t>
+                      </w:r>
+                      <w:proofErr w:type="spellEnd"/>
+                      <w:r>
+                        <w:t>=/</w:t>
+                      </w:r>
+                      <w:proofErr w:type="spellStart"/>
+                      <w:r>
+                        <w:t>usr</w:t>
+                      </w:r>
+                      <w:proofErr w:type="spellEnd"/>
+                      <w:r>
+                        <w:t>/bin/sleep 5</w:t>
+                      </w:r>
+                      <w:r>
+                        <w:br/>
+                      </w:r>
+                      <w:r>
+                        <w:t>ExecStart=/opt/usb-watcher/watcher.py</w:t>
                       </w:r>
                       <w:r>
                         <w:br/>
@@ -1746,6 +1875,17 @@
                       <w:r>
                         <w:br/>
                       </w:r>
+                      <w:proofErr w:type="spellStart"/>
+                      <w:r>
+                        <w:t>RestartSec</w:t>
+                      </w:r>
+                      <w:proofErr w:type="spellEnd"/>
+                      <w:r>
+                        <w:t>=3</w:t>
+                      </w:r>
+                      <w:r>
+                        <w:br/>
+                      </w:r>
                       <w:r>
                         <w:t>User=root</w:t>
                       </w:r>
@@ -1761,9 +1901,19 @@
                       <w:r>
                         <w:br/>
                       </w:r>
-                      <w:r>
-                        <w:t>WantedBy=multi-user.target</w:t>
-                      </w:r>
+                      <w:proofErr w:type="spellStart"/>
+                      <w:r>
+                        <w:t>WantedBy</w:t>
+                      </w:r>
+                      <w:proofErr w:type="spellEnd"/>
+                      <w:r>
+                        <w:t>=</w:t>
+                      </w:r>
+                      <w:proofErr w:type="spellStart"/>
+                      <w:r>
+                        <w:t>basic.target</w:t>
+                      </w:r>
+                      <w:proofErr w:type="spellEnd"/>
                     </w:p>
                   </w:txbxContent>
                 </v:textbox>
@@ -1787,47 +1937,149 @@
       <w:r>
         <w:t>sudo systemctl enable --now usb-watcher.service</w:t>
       </w:r>
+    </w:p>
+    <w:p>
+      <w:r>
+        <w:t>Now, whenever you modify the contents of PISHARE, the Pi will automatically look for “main.py” and run it!</w:t>
+      </w:r>
+    </w:p>
+    <w:p>
+      <w:r>
+        <w:t>To debug the watcher service, run:</w:t>
+      </w:r>
+    </w:p>
+    <w:p>
+      <w:r>
+        <w:t>sudo journalctl -u usb-watcher.service -n 50 --no-pager</w:t>
+      </w:r>
+    </w:p>
+    <w:p>
+      <w:r>
+        <w:t xml:space="preserve">Note: </w:t>
+      </w:r>
+      <w:r>
+        <w:t xml:space="preserve">pip running on the Pi can’t seem to sustain large package downloads. For larger dependencies, </w:t>
+      </w:r>
+      <w:r>
+        <w:t xml:space="preserve">upload them directly to the Pi using </w:t>
+      </w:r>
+      <w:r>
+        <w:t>PISHARE.</w:t>
+      </w:r>
+    </w:p>
+    <w:p>
+      <w:r>
+        <w:t>Install some other dependencies needed:</w:t>
+      </w:r>
+    </w:p>
+    <w:p>
+      <w:r>
+        <w:lastRenderedPageBreak/>
+        <w:t>sudo apt install python3.13-venv</w:t>
+      </w:r>
       <w:r>
         <w:br/>
       </w:r>
       <w:r>
-        <w:t>journalctl -u usb-watcher.service -f</w:t>
-      </w:r>
-    </w:p>
-    <w:p>
-      <w:r>
-        <w:t>Now, whenever you modify the contents of PISHARE, the Pi will automatically look for “main.py” and run it!</w:t>
-      </w:r>
-    </w:p>
-    <w:p>
-      <w:r>
-        <w:lastRenderedPageBreak/>
-        <w:t xml:space="preserve">Note: </w:t>
-      </w:r>
-      <w:r>
-        <w:t xml:space="preserve">pip running on the Pi can’t seem to sustain large package downloads. For larger dependencies, </w:t>
-      </w:r>
-      <w:r>
-        <w:t xml:space="preserve">upload them directly to the Pi using </w:t>
-      </w:r>
-      <w:r>
-        <w:t>PISHARE.</w:t>
-      </w:r>
-    </w:p>
-    <w:p>
-      <w:r>
-        <w:t>Install some other dependencies needed:</w:t>
-      </w:r>
-    </w:p>
-    <w:p>
-      <w:r>
-        <w:t>sudo apt install python3.13-venv</w:t>
-      </w:r>
-      <w:r>
-        <w:br/>
-      </w:r>
-      <w:r>
         <w:t>sudo apt-get install libportaudio2</w:t>
+      </w:r>
+    </w:p>
+    <w:p>
+      <w:r>
+        <w:rPr>
+          <w:b/>
+          <w:bCs/>
+        </w:rPr>
+        <w:t>Downgrading Python to 3.12.10</w:t>
+      </w:r>
+    </w:p>
+    <w:p>
+      <w:r>
+        <w:t>sudo apt update</w:t>
+      </w:r>
+    </w:p>
+    <w:p>
+      <w:r>
+        <w:t>sudo apt install -y build-essential libssl-dev zlib1g-dev libbz2-dev \</w:t>
+      </w:r>
+    </w:p>
+    <w:p>
+      <w:r>
+        <w:t>libreadline-dev libsqlite3-dev wget curl llvm libncurses5-dev libncursesw5-dev \</w:t>
+      </w:r>
+    </w:p>
+    <w:p>
+      <w:r>
+        <w:t>xz-utils tk-dev libffi-dev liblzma-dev git</w:t>
+      </w:r>
+    </w:p>
+    <w:p/>
+    <w:p>
+      <w:r>
+        <w:t>curl https://pyenv.run | bash</w:t>
+      </w:r>
+    </w:p>
+    <w:p/>
+    <w:p>
+      <w:r>
+        <w:t>echo 'export PYENV_ROOT="$HOME/.pyenv"' &gt;&gt; ~/.bashrc</w:t>
+      </w:r>
+    </w:p>
+    <w:p>
+      <w:r>
+        <w:t>echo '[[ -d $PYENV_ROOT/bin ]] &amp;&amp; export PATH="$PYENV_ROOT/bin:$PATH"' &gt;&gt; ~/.bashrc</w:t>
+      </w:r>
+    </w:p>
+    <w:p>
+      <w:r>
+        <w:t>echo 'eval "$(pyenv init -)"' &gt;&gt; ~/.bashrc</w:t>
+      </w:r>
+    </w:p>
+    <w:p>
+      <w:r>
+        <w:t>source ~/.bashrc</w:t>
+      </w:r>
+    </w:p>
+    <w:p/>
+    <w:p>
+      <w:r>
+        <w:t>pyenv install 3.12.10</w:t>
+      </w:r>
+    </w:p>
+    <w:p/>
+    <w:p>
+      <w:r>
+        <w:t>pyenv global 3.12.10</w:t>
+      </w:r>
+    </w:p>
+    <w:p/>
+    <w:p>
+      <w:r>
+        <w:rPr>
+          <w:b/>
+          <w:bCs/>
+        </w:rPr>
+        <w:t>Downgrade the venv too</w:t>
+      </w:r>
+    </w:p>
+    <w:p>
+      <w:r>
+        <w:t>sudo rm -rf /opt/payload-venv/</w:t>
+      </w:r>
+    </w:p>
+    <w:p>
+      <w:r>
+        <w:t>sudo /root/.pyenv/versions/3.12.10/bin/python3 -m venv /opt/payload-venv/</w:t>
+      </w:r>
+    </w:p>
+    <w:p>
+      <w:r>
+        <w:t>source /opt/payload-venv/bin/activate</w:t>
+      </w:r>
+    </w:p>
+    <w:p>
+      <w:r>
+        <w:t>python -V</w:t>
       </w:r>
     </w:p>
     <w:sectPr>
@@ -3590,6 +3842,29 @@
       <w:spacing w:val="5"/>
     </w:rPr>
   </w:style>
+  <w:style w:type="character" w:styleId="Hyperlink">
+    <w:name w:val="Hyperlink"/>
+    <w:basedOn w:val="DefaultParagraphFont"/>
+    <w:uiPriority w:val="99"/>
+    <w:unhideWhenUsed/>
+    <w:rsid w:val="00AE6949"/>
+    <w:rPr>
+      <w:color w:val="467886" w:themeColor="hyperlink"/>
+      <w:u w:val="single"/>
+    </w:rPr>
+  </w:style>
+  <w:style w:type="character" w:styleId="UnresolvedMention">
+    <w:name w:val="Unresolved Mention"/>
+    <w:basedOn w:val="DefaultParagraphFont"/>
+    <w:uiPriority w:val="99"/>
+    <w:semiHidden/>
+    <w:unhideWhenUsed/>
+    <w:rsid w:val="00AE6949"/>
+    <w:rPr>
+      <w:color w:val="605E5C"/>
+      <w:shd w:val="clear" w:color="auto" w:fill="E1DFDD"/>
+    </w:rPr>
+  </w:style>
 </w:styles>
 </file>
 

</xml_diff>